<commit_message>
update 1.4 Add evaluation result
</commit_message>
<xml_diff>
--- a/documents/PMB.docx
+++ b/documents/PMB.docx
@@ -673,1234 +673,18 @@
         <w:spacing w:after="0" w:line="276" w:lineRule="auto"/>
         <w:jc w:val="both"/>
         <w:rPr>
-          <w:rFonts w:ascii="Times New Roman" w:eastAsia="Times New Roman" w:hAnsi="Times New Roman" w:cs="Times New Roman"/>
-          <w:sz w:val="24"/>
-          <w:szCs w:val="24"/>
-        </w:rPr>
-      </w:pPr>
-      <w:proofErr w:type="spellStart"/>
-      <w:r>
-        <w:rPr>
-          <w:rFonts w:ascii="Times New Roman" w:eastAsia="Times New Roman" w:hAnsi="Times New Roman" w:cs="Times New Roman"/>
-          <w:sz w:val="24"/>
-          <w:szCs w:val="24"/>
-        </w:rPr>
-        <w:t>Didirikan</w:t>
-      </w:r>
-      <w:proofErr w:type="spellEnd"/>
-      <w:r>
-        <w:rPr>
-          <w:rFonts w:ascii="Times New Roman" w:eastAsia="Times New Roman" w:hAnsi="Times New Roman" w:cs="Times New Roman"/>
-          <w:sz w:val="24"/>
-          <w:szCs w:val="24"/>
-        </w:rPr>
-        <w:t xml:space="preserve"> pada </w:t>
-      </w:r>
-      <w:proofErr w:type="spellStart"/>
-      <w:r>
-        <w:rPr>
-          <w:rFonts w:ascii="Times New Roman" w:eastAsia="Times New Roman" w:hAnsi="Times New Roman" w:cs="Times New Roman"/>
-          <w:sz w:val="24"/>
-          <w:szCs w:val="24"/>
-        </w:rPr>
-        <w:t>tahun</w:t>
-      </w:r>
-      <w:proofErr w:type="spellEnd"/>
-      <w:r>
-        <w:rPr>
-          <w:rFonts w:ascii="Times New Roman" w:eastAsia="Times New Roman" w:hAnsi="Times New Roman" w:cs="Times New Roman"/>
-          <w:sz w:val="24"/>
-          <w:szCs w:val="24"/>
-        </w:rPr>
-        <w:t xml:space="preserve"> 1997 di </w:t>
-      </w:r>
-      <w:proofErr w:type="spellStart"/>
-      <w:r>
-        <w:rPr>
-          <w:rFonts w:ascii="Times New Roman" w:eastAsia="Times New Roman" w:hAnsi="Times New Roman" w:cs="Times New Roman"/>
-          <w:sz w:val="24"/>
-          <w:szCs w:val="24"/>
-        </w:rPr>
-        <w:t>bawah</w:t>
-      </w:r>
-      <w:proofErr w:type="spellEnd"/>
-      <w:r>
-        <w:rPr>
-          <w:rFonts w:ascii="Times New Roman" w:eastAsia="Times New Roman" w:hAnsi="Times New Roman" w:cs="Times New Roman"/>
-          <w:sz w:val="24"/>
-          <w:szCs w:val="24"/>
-        </w:rPr>
-        <w:t xml:space="preserve"> </w:t>
-      </w:r>
-      <w:proofErr w:type="spellStart"/>
-      <w:r>
-        <w:rPr>
-          <w:rFonts w:ascii="Times New Roman" w:eastAsia="Times New Roman" w:hAnsi="Times New Roman" w:cs="Times New Roman"/>
-          <w:sz w:val="24"/>
-          <w:szCs w:val="24"/>
-        </w:rPr>
-        <w:t>supervisi</w:t>
-      </w:r>
-      <w:proofErr w:type="spellEnd"/>
-      <w:r>
-        <w:rPr>
-          <w:rFonts w:ascii="Times New Roman" w:eastAsia="Times New Roman" w:hAnsi="Times New Roman" w:cs="Times New Roman"/>
-          <w:sz w:val="24"/>
-          <w:szCs w:val="24"/>
-        </w:rPr>
-        <w:t xml:space="preserve"> </w:t>
-      </w:r>
-      <w:proofErr w:type="spellStart"/>
-      <w:r>
-        <w:rPr>
-          <w:rFonts w:ascii="Times New Roman" w:eastAsia="Times New Roman" w:hAnsi="Times New Roman" w:cs="Times New Roman"/>
-          <w:sz w:val="24"/>
-          <w:szCs w:val="24"/>
-        </w:rPr>
-        <w:t>Institut</w:t>
-      </w:r>
-      <w:proofErr w:type="spellEnd"/>
-      <w:r>
-        <w:rPr>
-          <w:rFonts w:ascii="Times New Roman" w:eastAsia="Times New Roman" w:hAnsi="Times New Roman" w:cs="Times New Roman"/>
-          <w:sz w:val="24"/>
-          <w:szCs w:val="24"/>
-        </w:rPr>
-        <w:t xml:space="preserve"> </w:t>
-      </w:r>
-      <w:proofErr w:type="spellStart"/>
-      <w:r>
-        <w:rPr>
-          <w:rFonts w:ascii="Times New Roman" w:eastAsia="Times New Roman" w:hAnsi="Times New Roman" w:cs="Times New Roman"/>
-          <w:sz w:val="24"/>
-          <w:szCs w:val="24"/>
-        </w:rPr>
-        <w:t>Teknologi</w:t>
-      </w:r>
-      <w:proofErr w:type="spellEnd"/>
-      <w:r>
-        <w:rPr>
-          <w:rFonts w:ascii="Times New Roman" w:eastAsia="Times New Roman" w:hAnsi="Times New Roman" w:cs="Times New Roman"/>
-          <w:sz w:val="24"/>
-          <w:szCs w:val="24"/>
-        </w:rPr>
-        <w:t xml:space="preserve"> Bandung (ITB), STT </w:t>
-      </w:r>
-      <w:proofErr w:type="spellStart"/>
-      <w:r>
-        <w:rPr>
-          <w:rFonts w:ascii="Times New Roman" w:eastAsia="Times New Roman" w:hAnsi="Times New Roman" w:cs="Times New Roman"/>
-          <w:sz w:val="24"/>
-          <w:szCs w:val="24"/>
-        </w:rPr>
-        <w:t>Cipasung</w:t>
-      </w:r>
-      <w:proofErr w:type="spellEnd"/>
-      <w:r>
-        <w:rPr>
-          <w:rFonts w:ascii="Times New Roman" w:eastAsia="Times New Roman" w:hAnsi="Times New Roman" w:cs="Times New Roman"/>
-          <w:sz w:val="24"/>
-          <w:szCs w:val="24"/>
-        </w:rPr>
-        <w:t xml:space="preserve"> </w:t>
-      </w:r>
-      <w:proofErr w:type="spellStart"/>
-      <w:r>
-        <w:rPr>
-          <w:rFonts w:ascii="Times New Roman" w:eastAsia="Times New Roman" w:hAnsi="Times New Roman" w:cs="Times New Roman"/>
-          <w:sz w:val="24"/>
-          <w:szCs w:val="24"/>
-        </w:rPr>
-        <w:t>hadir</w:t>
-      </w:r>
-      <w:proofErr w:type="spellEnd"/>
-      <w:r>
-        <w:rPr>
-          <w:rFonts w:ascii="Times New Roman" w:eastAsia="Times New Roman" w:hAnsi="Times New Roman" w:cs="Times New Roman"/>
-          <w:sz w:val="24"/>
-          <w:szCs w:val="24"/>
-        </w:rPr>
-        <w:t xml:space="preserve"> </w:t>
-      </w:r>
-      <w:proofErr w:type="spellStart"/>
-      <w:r>
-        <w:rPr>
-          <w:rFonts w:ascii="Times New Roman" w:eastAsia="Times New Roman" w:hAnsi="Times New Roman" w:cs="Times New Roman"/>
-          <w:sz w:val="24"/>
-          <w:szCs w:val="24"/>
-        </w:rPr>
-        <w:t>untuk</w:t>
-      </w:r>
-      <w:proofErr w:type="spellEnd"/>
-      <w:r>
-        <w:rPr>
-          <w:rFonts w:ascii="Times New Roman" w:eastAsia="Times New Roman" w:hAnsi="Times New Roman" w:cs="Times New Roman"/>
-          <w:sz w:val="24"/>
-          <w:szCs w:val="24"/>
-        </w:rPr>
-        <w:t xml:space="preserve"> </w:t>
-      </w:r>
-      <w:proofErr w:type="spellStart"/>
-      <w:r>
-        <w:rPr>
-          <w:rFonts w:ascii="Times New Roman" w:eastAsia="Times New Roman" w:hAnsi="Times New Roman" w:cs="Times New Roman"/>
-          <w:sz w:val="24"/>
-          <w:szCs w:val="24"/>
-        </w:rPr>
-        <w:t>menjawab</w:t>
-      </w:r>
-      <w:proofErr w:type="spellEnd"/>
-      <w:r>
-        <w:rPr>
-          <w:rFonts w:ascii="Times New Roman" w:eastAsia="Times New Roman" w:hAnsi="Times New Roman" w:cs="Times New Roman"/>
-          <w:sz w:val="24"/>
-          <w:szCs w:val="24"/>
-        </w:rPr>
-        <w:t xml:space="preserve"> </w:t>
-      </w:r>
-      <w:proofErr w:type="spellStart"/>
-      <w:r>
-        <w:rPr>
-          <w:rFonts w:ascii="Times New Roman" w:eastAsia="Times New Roman" w:hAnsi="Times New Roman" w:cs="Times New Roman"/>
-          <w:sz w:val="24"/>
-          <w:szCs w:val="24"/>
-        </w:rPr>
-        <w:t>kebutuhan</w:t>
-      </w:r>
-      <w:proofErr w:type="spellEnd"/>
-      <w:r>
-        <w:rPr>
-          <w:rFonts w:ascii="Times New Roman" w:eastAsia="Times New Roman" w:hAnsi="Times New Roman" w:cs="Times New Roman"/>
-          <w:sz w:val="24"/>
-          <w:szCs w:val="24"/>
-        </w:rPr>
-        <w:t xml:space="preserve"> </w:t>
-      </w:r>
-      <w:proofErr w:type="spellStart"/>
-      <w:r>
-        <w:rPr>
-          <w:rFonts w:ascii="Times New Roman" w:eastAsia="Times New Roman" w:hAnsi="Times New Roman" w:cs="Times New Roman"/>
-          <w:sz w:val="24"/>
-          <w:szCs w:val="24"/>
-        </w:rPr>
-        <w:t>akan</w:t>
-      </w:r>
-      <w:proofErr w:type="spellEnd"/>
-      <w:r>
-        <w:rPr>
-          <w:rFonts w:ascii="Times New Roman" w:eastAsia="Times New Roman" w:hAnsi="Times New Roman" w:cs="Times New Roman"/>
-          <w:sz w:val="24"/>
-          <w:szCs w:val="24"/>
-        </w:rPr>
-        <w:t xml:space="preserve"> </w:t>
-      </w:r>
-      <w:proofErr w:type="spellStart"/>
-      <w:r>
-        <w:rPr>
-          <w:rFonts w:ascii="Times New Roman" w:eastAsia="Times New Roman" w:hAnsi="Times New Roman" w:cs="Times New Roman"/>
-          <w:sz w:val="24"/>
-          <w:szCs w:val="24"/>
-        </w:rPr>
-        <w:t>tenaga</w:t>
-      </w:r>
-      <w:proofErr w:type="spellEnd"/>
-      <w:r>
-        <w:rPr>
-          <w:rFonts w:ascii="Times New Roman" w:eastAsia="Times New Roman" w:hAnsi="Times New Roman" w:cs="Times New Roman"/>
-          <w:sz w:val="24"/>
-          <w:szCs w:val="24"/>
-        </w:rPr>
-        <w:t xml:space="preserve"> </w:t>
-      </w:r>
-      <w:proofErr w:type="spellStart"/>
-      <w:r>
-        <w:rPr>
-          <w:rFonts w:ascii="Times New Roman" w:eastAsia="Times New Roman" w:hAnsi="Times New Roman" w:cs="Times New Roman"/>
-          <w:sz w:val="24"/>
-          <w:szCs w:val="24"/>
-        </w:rPr>
-        <w:t>ahli</w:t>
-      </w:r>
-      <w:proofErr w:type="spellEnd"/>
-      <w:r>
-        <w:rPr>
-          <w:rFonts w:ascii="Times New Roman" w:eastAsia="Times New Roman" w:hAnsi="Times New Roman" w:cs="Times New Roman"/>
-          <w:sz w:val="24"/>
-          <w:szCs w:val="24"/>
-        </w:rPr>
-        <w:t xml:space="preserve"> </w:t>
-      </w:r>
-      <w:proofErr w:type="spellStart"/>
-      <w:r>
-        <w:rPr>
-          <w:rFonts w:ascii="Times New Roman" w:eastAsia="Times New Roman" w:hAnsi="Times New Roman" w:cs="Times New Roman"/>
-          <w:sz w:val="24"/>
-          <w:szCs w:val="24"/>
-        </w:rPr>
-        <w:t>teknik</w:t>
-      </w:r>
-      <w:proofErr w:type="spellEnd"/>
-      <w:r>
-        <w:rPr>
-          <w:rFonts w:ascii="Times New Roman" w:eastAsia="Times New Roman" w:hAnsi="Times New Roman" w:cs="Times New Roman"/>
-          <w:sz w:val="24"/>
-          <w:szCs w:val="24"/>
-        </w:rPr>
-        <w:t xml:space="preserve"> yang </w:t>
-      </w:r>
-      <w:proofErr w:type="spellStart"/>
-      <w:r>
-        <w:rPr>
-          <w:rFonts w:ascii="Times New Roman" w:eastAsia="Times New Roman" w:hAnsi="Times New Roman" w:cs="Times New Roman"/>
-          <w:sz w:val="24"/>
-          <w:szCs w:val="24"/>
-        </w:rPr>
-        <w:t>profesional</w:t>
-      </w:r>
-      <w:proofErr w:type="spellEnd"/>
-      <w:r>
-        <w:rPr>
-          <w:rFonts w:ascii="Times New Roman" w:eastAsia="Times New Roman" w:hAnsi="Times New Roman" w:cs="Times New Roman"/>
-          <w:sz w:val="24"/>
-          <w:szCs w:val="24"/>
-        </w:rPr>
-        <w:t xml:space="preserve">. </w:t>
-      </w:r>
-      <w:proofErr w:type="spellStart"/>
-      <w:r>
-        <w:rPr>
-          <w:rFonts w:ascii="Times New Roman" w:eastAsia="Times New Roman" w:hAnsi="Times New Roman" w:cs="Times New Roman"/>
-          <w:sz w:val="24"/>
-          <w:szCs w:val="24"/>
-        </w:rPr>
-        <w:t>Kehadirannya</w:t>
-      </w:r>
-      <w:proofErr w:type="spellEnd"/>
-      <w:r>
-        <w:rPr>
-          <w:rFonts w:ascii="Times New Roman" w:eastAsia="Times New Roman" w:hAnsi="Times New Roman" w:cs="Times New Roman"/>
-          <w:sz w:val="24"/>
-          <w:szCs w:val="24"/>
-        </w:rPr>
-        <w:t xml:space="preserve"> </w:t>
-      </w:r>
-      <w:proofErr w:type="spellStart"/>
-      <w:r>
-        <w:rPr>
-          <w:rFonts w:ascii="Times New Roman" w:eastAsia="Times New Roman" w:hAnsi="Times New Roman" w:cs="Times New Roman"/>
-          <w:sz w:val="24"/>
-          <w:szCs w:val="24"/>
-        </w:rPr>
-        <w:t>merupakan</w:t>
-      </w:r>
-      <w:proofErr w:type="spellEnd"/>
-      <w:r>
-        <w:rPr>
-          <w:rFonts w:ascii="Times New Roman" w:eastAsia="Times New Roman" w:hAnsi="Times New Roman" w:cs="Times New Roman"/>
-          <w:sz w:val="24"/>
-          <w:szCs w:val="24"/>
-        </w:rPr>
-        <w:t xml:space="preserve"> </w:t>
-      </w:r>
-      <w:proofErr w:type="spellStart"/>
-      <w:r>
-        <w:rPr>
-          <w:rFonts w:ascii="Times New Roman" w:eastAsia="Times New Roman" w:hAnsi="Times New Roman" w:cs="Times New Roman"/>
-          <w:sz w:val="24"/>
-          <w:szCs w:val="24"/>
-        </w:rPr>
-        <w:t>respons</w:t>
-      </w:r>
-      <w:proofErr w:type="spellEnd"/>
-      <w:r>
-        <w:rPr>
-          <w:rFonts w:ascii="Times New Roman" w:eastAsia="Times New Roman" w:hAnsi="Times New Roman" w:cs="Times New Roman"/>
-          <w:sz w:val="24"/>
-          <w:szCs w:val="24"/>
-        </w:rPr>
-        <w:t xml:space="preserve"> </w:t>
-      </w:r>
-      <w:proofErr w:type="spellStart"/>
-      <w:r>
-        <w:rPr>
-          <w:rFonts w:ascii="Times New Roman" w:eastAsia="Times New Roman" w:hAnsi="Times New Roman" w:cs="Times New Roman"/>
-          <w:sz w:val="24"/>
-          <w:szCs w:val="24"/>
-        </w:rPr>
-        <w:t>strategis</w:t>
-      </w:r>
-      <w:proofErr w:type="spellEnd"/>
-      <w:r>
-        <w:rPr>
-          <w:rFonts w:ascii="Times New Roman" w:eastAsia="Times New Roman" w:hAnsi="Times New Roman" w:cs="Times New Roman"/>
-          <w:sz w:val="24"/>
-          <w:szCs w:val="24"/>
-        </w:rPr>
-        <w:t xml:space="preserve"> </w:t>
-      </w:r>
-      <w:proofErr w:type="spellStart"/>
-      <w:r>
-        <w:rPr>
-          <w:rFonts w:ascii="Times New Roman" w:eastAsia="Times New Roman" w:hAnsi="Times New Roman" w:cs="Times New Roman"/>
-          <w:sz w:val="24"/>
-          <w:szCs w:val="24"/>
-        </w:rPr>
-        <w:t>dalam</w:t>
-      </w:r>
-      <w:proofErr w:type="spellEnd"/>
-      <w:r>
-        <w:rPr>
-          <w:rFonts w:ascii="Times New Roman" w:eastAsia="Times New Roman" w:hAnsi="Times New Roman" w:cs="Times New Roman"/>
-          <w:sz w:val="24"/>
-          <w:szCs w:val="24"/>
-        </w:rPr>
-        <w:t xml:space="preserve"> </w:t>
-      </w:r>
-      <w:proofErr w:type="spellStart"/>
-      <w:r>
-        <w:rPr>
-          <w:rFonts w:ascii="Times New Roman" w:eastAsia="Times New Roman" w:hAnsi="Times New Roman" w:cs="Times New Roman"/>
-          <w:sz w:val="24"/>
-          <w:szCs w:val="24"/>
-        </w:rPr>
-        <w:t>mendukung</w:t>
-      </w:r>
-      <w:proofErr w:type="spellEnd"/>
-      <w:r>
-        <w:rPr>
-          <w:rFonts w:ascii="Times New Roman" w:eastAsia="Times New Roman" w:hAnsi="Times New Roman" w:cs="Times New Roman"/>
-          <w:sz w:val="24"/>
-          <w:szCs w:val="24"/>
-        </w:rPr>
-        <w:t xml:space="preserve"> </w:t>
-      </w:r>
-      <w:proofErr w:type="spellStart"/>
-      <w:r>
-        <w:rPr>
-          <w:rFonts w:ascii="Times New Roman" w:eastAsia="Times New Roman" w:hAnsi="Times New Roman" w:cs="Times New Roman"/>
-          <w:sz w:val="24"/>
-          <w:szCs w:val="24"/>
-        </w:rPr>
-        <w:t>kemajuan</w:t>
-      </w:r>
-      <w:proofErr w:type="spellEnd"/>
-      <w:r>
-        <w:rPr>
-          <w:rFonts w:ascii="Times New Roman" w:eastAsia="Times New Roman" w:hAnsi="Times New Roman" w:cs="Times New Roman"/>
-          <w:sz w:val="24"/>
-          <w:szCs w:val="24"/>
-        </w:rPr>
-        <w:t xml:space="preserve"> </w:t>
-      </w:r>
-      <w:proofErr w:type="spellStart"/>
-      <w:r>
-        <w:rPr>
-          <w:rFonts w:ascii="Times New Roman" w:eastAsia="Times New Roman" w:hAnsi="Times New Roman" w:cs="Times New Roman"/>
-          <w:sz w:val="24"/>
-          <w:szCs w:val="24"/>
-        </w:rPr>
-        <w:t>industri</w:t>
-      </w:r>
-      <w:proofErr w:type="spellEnd"/>
-      <w:r>
-        <w:rPr>
-          <w:rFonts w:ascii="Times New Roman" w:eastAsia="Times New Roman" w:hAnsi="Times New Roman" w:cs="Times New Roman"/>
-          <w:sz w:val="24"/>
-          <w:szCs w:val="24"/>
-        </w:rPr>
-        <w:t xml:space="preserve"> </w:t>
-      </w:r>
-      <w:proofErr w:type="spellStart"/>
-      <w:r>
-        <w:rPr>
-          <w:rFonts w:ascii="Times New Roman" w:eastAsia="Times New Roman" w:hAnsi="Times New Roman" w:cs="Times New Roman"/>
-          <w:sz w:val="24"/>
-          <w:szCs w:val="24"/>
-        </w:rPr>
-        <w:t>serta</w:t>
-      </w:r>
-      <w:proofErr w:type="spellEnd"/>
-      <w:r>
-        <w:rPr>
-          <w:rFonts w:ascii="Times New Roman" w:eastAsia="Times New Roman" w:hAnsi="Times New Roman" w:cs="Times New Roman"/>
-          <w:sz w:val="24"/>
-          <w:szCs w:val="24"/>
-        </w:rPr>
-        <w:t xml:space="preserve"> </w:t>
-      </w:r>
-      <w:proofErr w:type="spellStart"/>
-      <w:r>
-        <w:rPr>
-          <w:rFonts w:ascii="Times New Roman" w:eastAsia="Times New Roman" w:hAnsi="Times New Roman" w:cs="Times New Roman"/>
-          <w:sz w:val="24"/>
-          <w:szCs w:val="24"/>
-        </w:rPr>
-        <w:t>kebutuhan</w:t>
-      </w:r>
-      <w:proofErr w:type="spellEnd"/>
-      <w:r>
-        <w:rPr>
-          <w:rFonts w:ascii="Times New Roman" w:eastAsia="Times New Roman" w:hAnsi="Times New Roman" w:cs="Times New Roman"/>
-          <w:sz w:val="24"/>
-          <w:szCs w:val="24"/>
-        </w:rPr>
-        <w:t xml:space="preserve"> </w:t>
-      </w:r>
-      <w:proofErr w:type="spellStart"/>
-      <w:r>
-        <w:rPr>
-          <w:rFonts w:ascii="Times New Roman" w:eastAsia="Times New Roman" w:hAnsi="Times New Roman" w:cs="Times New Roman"/>
-          <w:sz w:val="24"/>
-          <w:szCs w:val="24"/>
-        </w:rPr>
-        <w:t>masyarakat</w:t>
-      </w:r>
-      <w:proofErr w:type="spellEnd"/>
-      <w:r>
-        <w:rPr>
-          <w:rFonts w:ascii="Times New Roman" w:eastAsia="Times New Roman" w:hAnsi="Times New Roman" w:cs="Times New Roman"/>
-          <w:sz w:val="24"/>
-          <w:szCs w:val="24"/>
-        </w:rPr>
-        <w:t xml:space="preserve"> </w:t>
-      </w:r>
-      <w:proofErr w:type="spellStart"/>
-      <w:r>
-        <w:rPr>
-          <w:rFonts w:ascii="Times New Roman" w:eastAsia="Times New Roman" w:hAnsi="Times New Roman" w:cs="Times New Roman"/>
-          <w:sz w:val="24"/>
-          <w:szCs w:val="24"/>
-        </w:rPr>
-        <w:t>luas</w:t>
-      </w:r>
-      <w:proofErr w:type="spellEnd"/>
-      <w:r>
-        <w:rPr>
-          <w:rFonts w:ascii="Times New Roman" w:eastAsia="Times New Roman" w:hAnsi="Times New Roman" w:cs="Times New Roman"/>
-          <w:sz w:val="24"/>
-          <w:szCs w:val="24"/>
-        </w:rPr>
-        <w:t xml:space="preserve">. </w:t>
-      </w:r>
-      <w:proofErr w:type="spellStart"/>
-      <w:r>
-        <w:rPr>
-          <w:rFonts w:ascii="Times New Roman" w:eastAsia="Times New Roman" w:hAnsi="Times New Roman" w:cs="Times New Roman"/>
-          <w:sz w:val="24"/>
-          <w:szCs w:val="24"/>
-        </w:rPr>
-        <w:t>Berbasis</w:t>
-      </w:r>
-      <w:proofErr w:type="spellEnd"/>
-      <w:r>
-        <w:rPr>
-          <w:rFonts w:ascii="Times New Roman" w:eastAsia="Times New Roman" w:hAnsi="Times New Roman" w:cs="Times New Roman"/>
-          <w:sz w:val="24"/>
-          <w:szCs w:val="24"/>
-        </w:rPr>
-        <w:t xml:space="preserve"> </w:t>
-      </w:r>
-      <w:proofErr w:type="spellStart"/>
-      <w:r>
-        <w:rPr>
-          <w:rFonts w:ascii="Times New Roman" w:eastAsia="Times New Roman" w:hAnsi="Times New Roman" w:cs="Times New Roman"/>
-          <w:sz w:val="24"/>
-          <w:szCs w:val="24"/>
-        </w:rPr>
-        <w:t>lingkungan</w:t>
-      </w:r>
-      <w:proofErr w:type="spellEnd"/>
-      <w:r>
-        <w:rPr>
-          <w:rFonts w:ascii="Times New Roman" w:eastAsia="Times New Roman" w:hAnsi="Times New Roman" w:cs="Times New Roman"/>
-          <w:sz w:val="24"/>
-          <w:szCs w:val="24"/>
-        </w:rPr>
-        <w:t xml:space="preserve"> </w:t>
-      </w:r>
-      <w:proofErr w:type="spellStart"/>
-      <w:r>
-        <w:rPr>
-          <w:rFonts w:ascii="Times New Roman" w:eastAsia="Times New Roman" w:hAnsi="Times New Roman" w:cs="Times New Roman"/>
-          <w:sz w:val="24"/>
-          <w:szCs w:val="24"/>
-        </w:rPr>
-        <w:t>pesantren</w:t>
-      </w:r>
-      <w:proofErr w:type="spellEnd"/>
-      <w:r>
-        <w:rPr>
-          <w:rFonts w:ascii="Times New Roman" w:eastAsia="Times New Roman" w:hAnsi="Times New Roman" w:cs="Times New Roman"/>
-          <w:sz w:val="24"/>
-          <w:szCs w:val="24"/>
-        </w:rPr>
-        <w:t xml:space="preserve">, STT </w:t>
-      </w:r>
-      <w:proofErr w:type="spellStart"/>
-      <w:r>
-        <w:rPr>
-          <w:rFonts w:ascii="Times New Roman" w:eastAsia="Times New Roman" w:hAnsi="Times New Roman" w:cs="Times New Roman"/>
-          <w:sz w:val="24"/>
-          <w:szCs w:val="24"/>
-        </w:rPr>
-        <w:t>Cipasung</w:t>
-      </w:r>
-      <w:proofErr w:type="spellEnd"/>
-      <w:r>
-        <w:rPr>
-          <w:rFonts w:ascii="Times New Roman" w:eastAsia="Times New Roman" w:hAnsi="Times New Roman" w:cs="Times New Roman"/>
-          <w:sz w:val="24"/>
-          <w:szCs w:val="24"/>
-        </w:rPr>
-        <w:t xml:space="preserve"> </w:t>
-      </w:r>
-      <w:proofErr w:type="spellStart"/>
-      <w:r>
-        <w:rPr>
-          <w:rFonts w:ascii="Times New Roman" w:eastAsia="Times New Roman" w:hAnsi="Times New Roman" w:cs="Times New Roman"/>
-          <w:sz w:val="24"/>
-          <w:szCs w:val="24"/>
-        </w:rPr>
-        <w:t>memadukan</w:t>
-      </w:r>
-      <w:proofErr w:type="spellEnd"/>
-      <w:r>
-        <w:rPr>
-          <w:rFonts w:ascii="Times New Roman" w:eastAsia="Times New Roman" w:hAnsi="Times New Roman" w:cs="Times New Roman"/>
-          <w:sz w:val="24"/>
-          <w:szCs w:val="24"/>
-        </w:rPr>
-        <w:t xml:space="preserve"> </w:t>
-      </w:r>
-      <w:proofErr w:type="spellStart"/>
-      <w:r>
-        <w:rPr>
-          <w:rFonts w:ascii="Times New Roman" w:eastAsia="Times New Roman" w:hAnsi="Times New Roman" w:cs="Times New Roman"/>
-          <w:sz w:val="24"/>
-          <w:szCs w:val="24"/>
-        </w:rPr>
-        <w:t>ilmu</w:t>
-      </w:r>
-      <w:proofErr w:type="spellEnd"/>
-      <w:r>
-        <w:rPr>
-          <w:rFonts w:ascii="Times New Roman" w:eastAsia="Times New Roman" w:hAnsi="Times New Roman" w:cs="Times New Roman"/>
-          <w:sz w:val="24"/>
-          <w:szCs w:val="24"/>
-        </w:rPr>
-        <w:t xml:space="preserve"> </w:t>
-      </w:r>
-      <w:proofErr w:type="spellStart"/>
-      <w:r>
-        <w:rPr>
-          <w:rFonts w:ascii="Times New Roman" w:eastAsia="Times New Roman" w:hAnsi="Times New Roman" w:cs="Times New Roman"/>
-          <w:sz w:val="24"/>
-          <w:szCs w:val="24"/>
-        </w:rPr>
-        <w:t>pengetahuan</w:t>
-      </w:r>
-      <w:proofErr w:type="spellEnd"/>
-      <w:r>
-        <w:rPr>
-          <w:rFonts w:ascii="Times New Roman" w:eastAsia="Times New Roman" w:hAnsi="Times New Roman" w:cs="Times New Roman"/>
-          <w:sz w:val="24"/>
-          <w:szCs w:val="24"/>
-        </w:rPr>
-        <w:t xml:space="preserve"> </w:t>
-      </w:r>
-      <w:proofErr w:type="spellStart"/>
-      <w:r>
-        <w:rPr>
-          <w:rFonts w:ascii="Times New Roman" w:eastAsia="Times New Roman" w:hAnsi="Times New Roman" w:cs="Times New Roman"/>
-          <w:sz w:val="24"/>
-          <w:szCs w:val="24"/>
-        </w:rPr>
-        <w:t>dengan</w:t>
-      </w:r>
-      <w:proofErr w:type="spellEnd"/>
-      <w:r>
-        <w:rPr>
-          <w:rFonts w:ascii="Times New Roman" w:eastAsia="Times New Roman" w:hAnsi="Times New Roman" w:cs="Times New Roman"/>
-          <w:sz w:val="24"/>
-          <w:szCs w:val="24"/>
-        </w:rPr>
-        <w:t xml:space="preserve"> </w:t>
-      </w:r>
-      <w:proofErr w:type="spellStart"/>
-      <w:r>
-        <w:rPr>
-          <w:rFonts w:ascii="Times New Roman" w:eastAsia="Times New Roman" w:hAnsi="Times New Roman" w:cs="Times New Roman"/>
-          <w:sz w:val="24"/>
-          <w:szCs w:val="24"/>
-        </w:rPr>
-        <w:t>nilai-nilai</w:t>
-      </w:r>
-      <w:proofErr w:type="spellEnd"/>
-      <w:r>
-        <w:rPr>
-          <w:rFonts w:ascii="Times New Roman" w:eastAsia="Times New Roman" w:hAnsi="Times New Roman" w:cs="Times New Roman"/>
-          <w:sz w:val="24"/>
-          <w:szCs w:val="24"/>
-        </w:rPr>
-        <w:t xml:space="preserve"> </w:t>
-      </w:r>
-      <w:proofErr w:type="spellStart"/>
-      <w:r>
-        <w:rPr>
-          <w:rFonts w:ascii="Times New Roman" w:eastAsia="Times New Roman" w:hAnsi="Times New Roman" w:cs="Times New Roman"/>
-          <w:sz w:val="24"/>
-          <w:szCs w:val="24"/>
-        </w:rPr>
-        <w:t>keislaman</w:t>
-      </w:r>
-      <w:proofErr w:type="spellEnd"/>
-      <w:r>
-        <w:rPr>
-          <w:rFonts w:ascii="Times New Roman" w:eastAsia="Times New Roman" w:hAnsi="Times New Roman" w:cs="Times New Roman"/>
-          <w:sz w:val="24"/>
-          <w:szCs w:val="24"/>
-        </w:rPr>
-        <w:t xml:space="preserve">. </w:t>
-      </w:r>
-      <w:proofErr w:type="spellStart"/>
-      <w:r>
-        <w:rPr>
-          <w:rFonts w:ascii="Times New Roman" w:eastAsia="Times New Roman" w:hAnsi="Times New Roman" w:cs="Times New Roman"/>
-          <w:sz w:val="24"/>
-          <w:szCs w:val="24"/>
-        </w:rPr>
-        <w:t>Tujuannya</w:t>
-      </w:r>
-      <w:proofErr w:type="spellEnd"/>
-      <w:r>
-        <w:rPr>
-          <w:rFonts w:ascii="Times New Roman" w:eastAsia="Times New Roman" w:hAnsi="Times New Roman" w:cs="Times New Roman"/>
-          <w:sz w:val="24"/>
-          <w:szCs w:val="24"/>
-        </w:rPr>
-        <w:t xml:space="preserve"> </w:t>
-      </w:r>
-      <w:proofErr w:type="spellStart"/>
-      <w:r>
-        <w:rPr>
-          <w:rFonts w:ascii="Times New Roman" w:eastAsia="Times New Roman" w:hAnsi="Times New Roman" w:cs="Times New Roman"/>
-          <w:sz w:val="24"/>
-          <w:szCs w:val="24"/>
-        </w:rPr>
-        <w:t>adalah</w:t>
-      </w:r>
-      <w:proofErr w:type="spellEnd"/>
-      <w:r>
-        <w:rPr>
-          <w:rFonts w:ascii="Times New Roman" w:eastAsia="Times New Roman" w:hAnsi="Times New Roman" w:cs="Times New Roman"/>
-          <w:sz w:val="24"/>
-          <w:szCs w:val="24"/>
-        </w:rPr>
-        <w:t xml:space="preserve"> </w:t>
-      </w:r>
-      <w:proofErr w:type="spellStart"/>
-      <w:r>
-        <w:rPr>
-          <w:rFonts w:ascii="Times New Roman" w:eastAsia="Times New Roman" w:hAnsi="Times New Roman" w:cs="Times New Roman"/>
-          <w:sz w:val="24"/>
-          <w:szCs w:val="24"/>
-        </w:rPr>
-        <w:t>mencetak</w:t>
-      </w:r>
-      <w:proofErr w:type="spellEnd"/>
-      <w:r>
-        <w:rPr>
-          <w:rFonts w:ascii="Times New Roman" w:eastAsia="Times New Roman" w:hAnsi="Times New Roman" w:cs="Times New Roman"/>
-          <w:sz w:val="24"/>
-          <w:szCs w:val="24"/>
-        </w:rPr>
-        <w:t xml:space="preserve"> </w:t>
-      </w:r>
-      <w:proofErr w:type="spellStart"/>
-      <w:r>
-        <w:rPr>
-          <w:rFonts w:ascii="Times New Roman" w:eastAsia="Times New Roman" w:hAnsi="Times New Roman" w:cs="Times New Roman"/>
-          <w:sz w:val="24"/>
-          <w:szCs w:val="24"/>
-        </w:rPr>
-        <w:t>lulusan</w:t>
-      </w:r>
-      <w:proofErr w:type="spellEnd"/>
-      <w:r>
-        <w:rPr>
-          <w:rFonts w:ascii="Times New Roman" w:eastAsia="Times New Roman" w:hAnsi="Times New Roman" w:cs="Times New Roman"/>
-          <w:sz w:val="24"/>
-          <w:szCs w:val="24"/>
-        </w:rPr>
-        <w:t xml:space="preserve"> yang </w:t>
-      </w:r>
-      <w:proofErr w:type="spellStart"/>
-      <w:r>
-        <w:rPr>
-          <w:rFonts w:ascii="Times New Roman" w:eastAsia="Times New Roman" w:hAnsi="Times New Roman" w:cs="Times New Roman"/>
-          <w:sz w:val="24"/>
-          <w:szCs w:val="24"/>
-        </w:rPr>
-        <w:t>tidak</w:t>
-      </w:r>
-      <w:proofErr w:type="spellEnd"/>
-      <w:r>
-        <w:rPr>
-          <w:rFonts w:ascii="Times New Roman" w:eastAsia="Times New Roman" w:hAnsi="Times New Roman" w:cs="Times New Roman"/>
-          <w:sz w:val="24"/>
-          <w:szCs w:val="24"/>
-        </w:rPr>
-        <w:t xml:space="preserve"> </w:t>
-      </w:r>
-      <w:proofErr w:type="spellStart"/>
-      <w:r>
-        <w:rPr>
-          <w:rFonts w:ascii="Times New Roman" w:eastAsia="Times New Roman" w:hAnsi="Times New Roman" w:cs="Times New Roman"/>
-          <w:sz w:val="24"/>
-          <w:szCs w:val="24"/>
-        </w:rPr>
-        <w:t>hanya</w:t>
-      </w:r>
-      <w:proofErr w:type="spellEnd"/>
-      <w:r>
-        <w:rPr>
-          <w:rFonts w:ascii="Times New Roman" w:eastAsia="Times New Roman" w:hAnsi="Times New Roman" w:cs="Times New Roman"/>
-          <w:sz w:val="24"/>
-          <w:szCs w:val="24"/>
-        </w:rPr>
-        <w:t xml:space="preserve"> </w:t>
-      </w:r>
-      <w:proofErr w:type="spellStart"/>
-      <w:r>
-        <w:rPr>
-          <w:rFonts w:ascii="Times New Roman" w:eastAsia="Times New Roman" w:hAnsi="Times New Roman" w:cs="Times New Roman"/>
-          <w:sz w:val="24"/>
-          <w:szCs w:val="24"/>
-        </w:rPr>
-        <w:t>unggul</w:t>
-      </w:r>
-      <w:proofErr w:type="spellEnd"/>
-      <w:r>
-        <w:rPr>
-          <w:rFonts w:ascii="Times New Roman" w:eastAsia="Times New Roman" w:hAnsi="Times New Roman" w:cs="Times New Roman"/>
-          <w:sz w:val="24"/>
-          <w:szCs w:val="24"/>
-        </w:rPr>
-        <w:t xml:space="preserve"> </w:t>
-      </w:r>
-      <w:proofErr w:type="spellStart"/>
-      <w:r>
-        <w:rPr>
-          <w:rFonts w:ascii="Times New Roman" w:eastAsia="Times New Roman" w:hAnsi="Times New Roman" w:cs="Times New Roman"/>
-          <w:sz w:val="24"/>
-          <w:szCs w:val="24"/>
-        </w:rPr>
-        <w:t>secara</w:t>
-      </w:r>
-      <w:proofErr w:type="spellEnd"/>
-      <w:r>
-        <w:rPr>
-          <w:rFonts w:ascii="Times New Roman" w:eastAsia="Times New Roman" w:hAnsi="Times New Roman" w:cs="Times New Roman"/>
-          <w:sz w:val="24"/>
-          <w:szCs w:val="24"/>
-        </w:rPr>
-        <w:t xml:space="preserve"> </w:t>
-      </w:r>
-      <w:proofErr w:type="spellStart"/>
-      <w:r>
-        <w:rPr>
-          <w:rFonts w:ascii="Times New Roman" w:eastAsia="Times New Roman" w:hAnsi="Times New Roman" w:cs="Times New Roman"/>
-          <w:sz w:val="24"/>
-          <w:szCs w:val="24"/>
-        </w:rPr>
-        <w:t>intelektual</w:t>
-      </w:r>
-      <w:proofErr w:type="spellEnd"/>
-      <w:r>
-        <w:rPr>
-          <w:rFonts w:ascii="Times New Roman" w:eastAsia="Times New Roman" w:hAnsi="Times New Roman" w:cs="Times New Roman"/>
-          <w:sz w:val="24"/>
-          <w:szCs w:val="24"/>
-        </w:rPr>
-        <w:t xml:space="preserve">, </w:t>
-      </w:r>
-      <w:proofErr w:type="spellStart"/>
-      <w:r>
-        <w:rPr>
-          <w:rFonts w:ascii="Times New Roman" w:eastAsia="Times New Roman" w:hAnsi="Times New Roman" w:cs="Times New Roman"/>
-          <w:sz w:val="24"/>
-          <w:szCs w:val="24"/>
-        </w:rPr>
-        <w:t>tetapi</w:t>
-      </w:r>
-      <w:proofErr w:type="spellEnd"/>
-      <w:r>
-        <w:rPr>
-          <w:rFonts w:ascii="Times New Roman" w:eastAsia="Times New Roman" w:hAnsi="Times New Roman" w:cs="Times New Roman"/>
-          <w:sz w:val="24"/>
-          <w:szCs w:val="24"/>
-        </w:rPr>
-        <w:t xml:space="preserve"> juga </w:t>
-      </w:r>
-      <w:proofErr w:type="spellStart"/>
-      <w:r>
-        <w:rPr>
-          <w:rFonts w:ascii="Times New Roman" w:eastAsia="Times New Roman" w:hAnsi="Times New Roman" w:cs="Times New Roman"/>
-          <w:sz w:val="24"/>
-          <w:szCs w:val="24"/>
-        </w:rPr>
-        <w:t>berakhlak</w:t>
-      </w:r>
-      <w:proofErr w:type="spellEnd"/>
-      <w:r>
-        <w:rPr>
-          <w:rFonts w:ascii="Times New Roman" w:eastAsia="Times New Roman" w:hAnsi="Times New Roman" w:cs="Times New Roman"/>
-          <w:sz w:val="24"/>
-          <w:szCs w:val="24"/>
-        </w:rPr>
-        <w:t xml:space="preserve"> </w:t>
-      </w:r>
-      <w:proofErr w:type="spellStart"/>
-      <w:r>
-        <w:rPr>
-          <w:rFonts w:ascii="Times New Roman" w:eastAsia="Times New Roman" w:hAnsi="Times New Roman" w:cs="Times New Roman"/>
-          <w:sz w:val="24"/>
-          <w:szCs w:val="24"/>
-        </w:rPr>
-        <w:t>mulia</w:t>
-      </w:r>
-      <w:proofErr w:type="spellEnd"/>
-      <w:r>
-        <w:rPr>
-          <w:rFonts w:ascii="Times New Roman" w:eastAsia="Times New Roman" w:hAnsi="Times New Roman" w:cs="Times New Roman"/>
-          <w:sz w:val="24"/>
-          <w:szCs w:val="24"/>
-        </w:rPr>
-        <w:t xml:space="preserve">. Demi </w:t>
-      </w:r>
-      <w:proofErr w:type="spellStart"/>
-      <w:r>
-        <w:rPr>
-          <w:rFonts w:ascii="Times New Roman" w:eastAsia="Times New Roman" w:hAnsi="Times New Roman" w:cs="Times New Roman"/>
-          <w:sz w:val="24"/>
-          <w:szCs w:val="24"/>
-        </w:rPr>
-        <w:t>mencetak</w:t>
-      </w:r>
-      <w:proofErr w:type="spellEnd"/>
-      <w:r>
-        <w:rPr>
-          <w:rFonts w:ascii="Times New Roman" w:eastAsia="Times New Roman" w:hAnsi="Times New Roman" w:cs="Times New Roman"/>
-          <w:sz w:val="24"/>
-          <w:szCs w:val="24"/>
-        </w:rPr>
-        <w:t xml:space="preserve"> SDM </w:t>
-      </w:r>
-      <w:proofErr w:type="spellStart"/>
-      <w:r>
-        <w:rPr>
-          <w:rFonts w:ascii="Times New Roman" w:eastAsia="Times New Roman" w:hAnsi="Times New Roman" w:cs="Times New Roman"/>
-          <w:sz w:val="24"/>
-          <w:szCs w:val="24"/>
-        </w:rPr>
-        <w:t>berkualitas</w:t>
-      </w:r>
-      <w:proofErr w:type="spellEnd"/>
-      <w:r>
-        <w:rPr>
-          <w:rFonts w:ascii="Times New Roman" w:eastAsia="Times New Roman" w:hAnsi="Times New Roman" w:cs="Times New Roman"/>
-          <w:sz w:val="24"/>
-          <w:szCs w:val="24"/>
-        </w:rPr>
-        <w:t xml:space="preserve">, </w:t>
-      </w:r>
-      <w:proofErr w:type="spellStart"/>
-      <w:r>
-        <w:rPr>
-          <w:rFonts w:ascii="Times New Roman" w:eastAsia="Times New Roman" w:hAnsi="Times New Roman" w:cs="Times New Roman"/>
-          <w:sz w:val="24"/>
-          <w:szCs w:val="24"/>
-        </w:rPr>
-        <w:t>kini</w:t>
-      </w:r>
-      <w:proofErr w:type="spellEnd"/>
-      <w:r>
-        <w:rPr>
-          <w:rFonts w:ascii="Times New Roman" w:eastAsia="Times New Roman" w:hAnsi="Times New Roman" w:cs="Times New Roman"/>
-          <w:sz w:val="24"/>
-          <w:szCs w:val="24"/>
-        </w:rPr>
-        <w:t xml:space="preserve"> STT </w:t>
-      </w:r>
-      <w:proofErr w:type="spellStart"/>
-      <w:r>
-        <w:rPr>
-          <w:rFonts w:ascii="Times New Roman" w:eastAsia="Times New Roman" w:hAnsi="Times New Roman" w:cs="Times New Roman"/>
-          <w:sz w:val="24"/>
-          <w:szCs w:val="24"/>
-        </w:rPr>
-        <w:t>Cipasung</w:t>
-      </w:r>
-      <w:proofErr w:type="spellEnd"/>
-      <w:r>
-        <w:rPr>
-          <w:rFonts w:ascii="Times New Roman" w:eastAsia="Times New Roman" w:hAnsi="Times New Roman" w:cs="Times New Roman"/>
-          <w:sz w:val="24"/>
-          <w:szCs w:val="24"/>
-        </w:rPr>
-        <w:t xml:space="preserve"> </w:t>
-      </w:r>
-      <w:proofErr w:type="spellStart"/>
-      <w:r>
-        <w:rPr>
-          <w:rFonts w:ascii="Times New Roman" w:eastAsia="Times New Roman" w:hAnsi="Times New Roman" w:cs="Times New Roman"/>
-          <w:sz w:val="24"/>
-          <w:szCs w:val="24"/>
-        </w:rPr>
-        <w:t>fokus</w:t>
-      </w:r>
-      <w:proofErr w:type="spellEnd"/>
-      <w:r>
-        <w:rPr>
-          <w:rFonts w:ascii="Times New Roman" w:eastAsia="Times New Roman" w:hAnsi="Times New Roman" w:cs="Times New Roman"/>
-          <w:sz w:val="24"/>
-          <w:szCs w:val="24"/>
-        </w:rPr>
-        <w:t xml:space="preserve"> pada program </w:t>
-      </w:r>
-      <w:proofErr w:type="spellStart"/>
-      <w:r>
-        <w:rPr>
-          <w:rFonts w:ascii="Times New Roman" w:eastAsia="Times New Roman" w:hAnsi="Times New Roman" w:cs="Times New Roman"/>
-          <w:sz w:val="24"/>
-          <w:szCs w:val="24"/>
-        </w:rPr>
-        <w:t>studi</w:t>
-      </w:r>
-      <w:proofErr w:type="spellEnd"/>
-      <w:r>
-        <w:rPr>
-          <w:rFonts w:ascii="Times New Roman" w:eastAsia="Times New Roman" w:hAnsi="Times New Roman" w:cs="Times New Roman"/>
-          <w:sz w:val="24"/>
-          <w:szCs w:val="24"/>
-        </w:rPr>
-        <w:t xml:space="preserve"> Teknik </w:t>
-      </w:r>
-      <w:proofErr w:type="spellStart"/>
-      <w:r>
-        <w:rPr>
-          <w:rFonts w:ascii="Times New Roman" w:eastAsia="Times New Roman" w:hAnsi="Times New Roman" w:cs="Times New Roman"/>
-          <w:sz w:val="24"/>
-          <w:szCs w:val="24"/>
-        </w:rPr>
-        <w:t>Industri</w:t>
-      </w:r>
-      <w:proofErr w:type="spellEnd"/>
-      <w:r>
-        <w:rPr>
-          <w:rFonts w:ascii="Times New Roman" w:eastAsia="Times New Roman" w:hAnsi="Times New Roman" w:cs="Times New Roman"/>
-          <w:sz w:val="24"/>
-          <w:szCs w:val="24"/>
-        </w:rPr>
-        <w:t xml:space="preserve"> dan </w:t>
-      </w:r>
-      <w:proofErr w:type="spellStart"/>
-      <w:r>
-        <w:rPr>
-          <w:rFonts w:ascii="Times New Roman" w:eastAsia="Times New Roman" w:hAnsi="Times New Roman" w:cs="Times New Roman"/>
-          <w:sz w:val="24"/>
-          <w:szCs w:val="24"/>
-        </w:rPr>
-        <w:t>Informatika</w:t>
-      </w:r>
-      <w:proofErr w:type="spellEnd"/>
-      <w:r>
-        <w:rPr>
-          <w:rFonts w:ascii="Times New Roman" w:eastAsia="Times New Roman" w:hAnsi="Times New Roman" w:cs="Times New Roman"/>
-          <w:sz w:val="24"/>
-          <w:szCs w:val="24"/>
-        </w:rPr>
-        <w:t xml:space="preserve">. </w:t>
-      </w:r>
-      <w:proofErr w:type="spellStart"/>
-      <w:r>
-        <w:rPr>
-          <w:rFonts w:ascii="Times New Roman" w:eastAsia="Times New Roman" w:hAnsi="Times New Roman" w:cs="Times New Roman"/>
-          <w:sz w:val="24"/>
-          <w:szCs w:val="24"/>
-        </w:rPr>
-        <w:t>Keduanya</w:t>
-      </w:r>
-      <w:proofErr w:type="spellEnd"/>
-      <w:r>
-        <w:rPr>
-          <w:rFonts w:ascii="Times New Roman" w:eastAsia="Times New Roman" w:hAnsi="Times New Roman" w:cs="Times New Roman"/>
-          <w:sz w:val="24"/>
-          <w:szCs w:val="24"/>
-        </w:rPr>
-        <w:t xml:space="preserve"> </w:t>
-      </w:r>
-      <w:proofErr w:type="spellStart"/>
-      <w:r>
-        <w:rPr>
-          <w:rFonts w:ascii="Times New Roman" w:eastAsia="Times New Roman" w:hAnsi="Times New Roman" w:cs="Times New Roman"/>
-          <w:sz w:val="24"/>
-          <w:szCs w:val="24"/>
-        </w:rPr>
-        <w:t>dirancang</w:t>
-      </w:r>
-      <w:proofErr w:type="spellEnd"/>
-      <w:r>
-        <w:rPr>
-          <w:rFonts w:ascii="Times New Roman" w:eastAsia="Times New Roman" w:hAnsi="Times New Roman" w:cs="Times New Roman"/>
-          <w:sz w:val="24"/>
-          <w:szCs w:val="24"/>
-        </w:rPr>
-        <w:t xml:space="preserve"> </w:t>
-      </w:r>
-      <w:proofErr w:type="spellStart"/>
-      <w:r>
-        <w:rPr>
-          <w:rFonts w:ascii="Times New Roman" w:eastAsia="Times New Roman" w:hAnsi="Times New Roman" w:cs="Times New Roman"/>
-          <w:sz w:val="24"/>
-          <w:szCs w:val="24"/>
-        </w:rPr>
-        <w:t>untuk</w:t>
-      </w:r>
-      <w:proofErr w:type="spellEnd"/>
-      <w:r>
-        <w:rPr>
-          <w:rFonts w:ascii="Times New Roman" w:eastAsia="Times New Roman" w:hAnsi="Times New Roman" w:cs="Times New Roman"/>
-          <w:sz w:val="24"/>
-          <w:szCs w:val="24"/>
-        </w:rPr>
-        <w:t xml:space="preserve"> </w:t>
-      </w:r>
-      <w:proofErr w:type="spellStart"/>
-      <w:r>
-        <w:rPr>
-          <w:rFonts w:ascii="Times New Roman" w:eastAsia="Times New Roman" w:hAnsi="Times New Roman" w:cs="Times New Roman"/>
-          <w:sz w:val="24"/>
-          <w:szCs w:val="24"/>
-        </w:rPr>
-        <w:t>melahirkan</w:t>
-      </w:r>
-      <w:proofErr w:type="spellEnd"/>
-      <w:r>
-        <w:rPr>
-          <w:rFonts w:ascii="Times New Roman" w:eastAsia="Times New Roman" w:hAnsi="Times New Roman" w:cs="Times New Roman"/>
-          <w:sz w:val="24"/>
-          <w:szCs w:val="24"/>
-        </w:rPr>
-        <w:t xml:space="preserve"> </w:t>
-      </w:r>
-      <w:proofErr w:type="spellStart"/>
-      <w:r>
-        <w:rPr>
-          <w:rFonts w:ascii="Times New Roman" w:eastAsia="Times New Roman" w:hAnsi="Times New Roman" w:cs="Times New Roman"/>
-          <w:sz w:val="24"/>
-          <w:szCs w:val="24"/>
-        </w:rPr>
-        <w:t>tenaga</w:t>
-      </w:r>
-      <w:proofErr w:type="spellEnd"/>
-      <w:r>
-        <w:rPr>
-          <w:rFonts w:ascii="Times New Roman" w:eastAsia="Times New Roman" w:hAnsi="Times New Roman" w:cs="Times New Roman"/>
-          <w:sz w:val="24"/>
-          <w:szCs w:val="24"/>
-        </w:rPr>
-        <w:t xml:space="preserve"> </w:t>
-      </w:r>
-      <w:proofErr w:type="spellStart"/>
-      <w:r>
-        <w:rPr>
-          <w:rFonts w:ascii="Times New Roman" w:eastAsia="Times New Roman" w:hAnsi="Times New Roman" w:cs="Times New Roman"/>
-          <w:sz w:val="24"/>
-          <w:szCs w:val="24"/>
-        </w:rPr>
-        <w:t>profesional</w:t>
-      </w:r>
-      <w:proofErr w:type="spellEnd"/>
-      <w:r>
-        <w:rPr>
-          <w:rFonts w:ascii="Times New Roman" w:eastAsia="Times New Roman" w:hAnsi="Times New Roman" w:cs="Times New Roman"/>
-          <w:sz w:val="24"/>
-          <w:szCs w:val="24"/>
-        </w:rPr>
-        <w:t xml:space="preserve"> yang </w:t>
-      </w:r>
-      <w:proofErr w:type="spellStart"/>
-      <w:r>
-        <w:rPr>
-          <w:rFonts w:ascii="Times New Roman" w:eastAsia="Times New Roman" w:hAnsi="Times New Roman" w:cs="Times New Roman"/>
-          <w:sz w:val="24"/>
-          <w:szCs w:val="24"/>
-        </w:rPr>
-        <w:t>kompeten</w:t>
-      </w:r>
-      <w:proofErr w:type="spellEnd"/>
-      <w:r>
-        <w:rPr>
-          <w:rFonts w:ascii="Times New Roman" w:eastAsia="Times New Roman" w:hAnsi="Times New Roman" w:cs="Times New Roman"/>
-          <w:sz w:val="24"/>
-          <w:szCs w:val="24"/>
-        </w:rPr>
-        <w:t xml:space="preserve"> dan </w:t>
-      </w:r>
-      <w:proofErr w:type="spellStart"/>
-      <w:r>
-        <w:rPr>
-          <w:rFonts w:ascii="Times New Roman" w:eastAsia="Times New Roman" w:hAnsi="Times New Roman" w:cs="Times New Roman"/>
-          <w:sz w:val="24"/>
-          <w:szCs w:val="24"/>
-        </w:rPr>
-        <w:t>siap</w:t>
-      </w:r>
-      <w:proofErr w:type="spellEnd"/>
-      <w:r>
-        <w:rPr>
-          <w:rFonts w:ascii="Times New Roman" w:eastAsia="Times New Roman" w:hAnsi="Times New Roman" w:cs="Times New Roman"/>
-          <w:sz w:val="24"/>
-          <w:szCs w:val="24"/>
-        </w:rPr>
-        <w:t xml:space="preserve"> </w:t>
-      </w:r>
-      <w:proofErr w:type="spellStart"/>
-      <w:r>
-        <w:rPr>
-          <w:rFonts w:ascii="Times New Roman" w:eastAsia="Times New Roman" w:hAnsi="Times New Roman" w:cs="Times New Roman"/>
-          <w:sz w:val="24"/>
-          <w:szCs w:val="24"/>
-        </w:rPr>
-        <w:t>bersaing</w:t>
-      </w:r>
-      <w:proofErr w:type="spellEnd"/>
-      <w:r>
-        <w:rPr>
-          <w:rFonts w:ascii="Times New Roman" w:eastAsia="Times New Roman" w:hAnsi="Times New Roman" w:cs="Times New Roman"/>
-          <w:sz w:val="24"/>
-          <w:szCs w:val="24"/>
-        </w:rPr>
-        <w:t xml:space="preserve"> di dunia </w:t>
-      </w:r>
-      <w:proofErr w:type="spellStart"/>
-      <w:r>
-        <w:rPr>
-          <w:rFonts w:ascii="Times New Roman" w:eastAsia="Times New Roman" w:hAnsi="Times New Roman" w:cs="Times New Roman"/>
-          <w:sz w:val="24"/>
-          <w:szCs w:val="24"/>
-        </w:rPr>
-        <w:t>kerja</w:t>
-      </w:r>
-      <w:proofErr w:type="spellEnd"/>
-      <w:r>
-        <w:rPr>
-          <w:rFonts w:ascii="Times New Roman" w:eastAsia="Times New Roman" w:hAnsi="Times New Roman" w:cs="Times New Roman"/>
-          <w:sz w:val="24"/>
-          <w:szCs w:val="24"/>
-        </w:rPr>
-        <w:t xml:space="preserve">. </w:t>
+          <w:rFonts w:ascii="Times New Roman" w:hAnsi="Times New Roman" w:eastAsia="Times New Roman" w:cs="Times New Roman"/>
+          <w:sz w:val="24"/>
+          <w:szCs w:val="24"/>
+        </w:rPr>
+      </w:pPr>
+      <w:r>
+        <w:rPr>
+          <w:rFonts w:ascii="Times New Roman" w:hAnsi="Times New Roman" w:eastAsia="Times New Roman" w:cs="Times New Roman"/>
+          <w:sz w:val="24"/>
+          <w:szCs w:val="24"/>
+        </w:rPr>
+        <w:t xml:space="preserve">Sekolah Tinggi Teknologi Cipasung (STTC) Didirikan pada tahun 1997, di bawah supervisi Institut Teknologi Bandung (ITB), STT Cipasung hadir untuk menjawab kebutuhan akan tenaga ahli teknik yang profesional. Kehadirannya merupakan respons strategis dalam mendukung kemajuan industri serta kebutuhan masyarakat luas. Berbasis lingkungan pesantren, STT Cipasung memadukan ilmu pengetahuan dengan nilai-nilai keislaman. Tujuannya adalah mencetak lulusan yang tidak hanya unggul secara intelektual, tetapi juga berakhlak mulia. Demi mencetak SDM berkualitas, kini STT Cipasung fokus pada program studi Teknik Industri dan Informatika. Keduanya dirancang untuk melahirkan tenaga profesional yang kompeten dan siap bersaing di dunia kerja. </w:t>
       </w:r>
     </w:p>
     <w:p>

</xml_diff>